<commit_message>
review: URL Endpoint QRIS apa adanya
</commit_message>
<xml_diff>
--- a/output/Lampiran 7C - Hasil UAT QRIS.docx
+++ b/output/Lampiran 7C - Hasil UAT QRIS.docx
@@ -3259,7 +3259,18 @@
               <w:rPr>
                 <w:rFonts w:ascii="Calibri" w:hAnsi="Calibri"/>
               </w:rPr>
-              <w:t>https://ob-sandbox.banksampoerna.co.id/snap-qris/v1.1/qr/qr-mpm-generate</w:t>
+              <w:t>POST /snap-qris/v1.1/qr/qr-mpm-generate HTTP/1.1</w:t>
+            </w:r>
+          </w:p>
+          <w:p>
+            <w:pPr>
+              <w:jc w:val="left"/>
+            </w:pPr>
+            <w:r>
+              <w:rPr>
+                <w:rFonts w:ascii="Calibri" w:hAnsi="Calibri"/>
+              </w:rPr>
+              <w:t>Host: ob-sandbox.banksampoerna.co.id</w:t>
             </w:r>
           </w:p>
           <w:p>
@@ -3293,17 +3304,6 @@
                 <w:rFonts w:ascii="Calibri" w:hAnsi="Calibri"/>
               </w:rPr>
               <w:t>[</w:t>
-            </w:r>
-          </w:p>
-          <w:p>
-            <w:pPr>
-              <w:jc w:val="left"/>
-            </w:pPr>
-            <w:r>
-              <w:rPr>
-                <w:rFonts w:ascii="Calibri" w:hAnsi="Calibri"/>
-              </w:rPr>
-              <w:t xml:space="preserve">  "Host=ob-sandbox.banksampoerna.co.id",</w:t>
             </w:r>
           </w:p>
           <w:p>
@@ -3735,7 +3735,18 @@
               <w:rPr>
                 <w:rFonts w:ascii="Calibri" w:hAnsi="Calibri"/>
               </w:rPr>
-              <w:t>https://ob-sandbox.banksampoerna.co.id/snap-qris/v1.1/qr/qr-mpm-generate</w:t>
+              <w:t>POST /snap-qris/v1.1/qr/qr-mpm-generate HTTP/1.1</w:t>
+            </w:r>
+          </w:p>
+          <w:p>
+            <w:pPr>
+              <w:jc w:val="left"/>
+            </w:pPr>
+            <w:r>
+              <w:rPr>
+                <w:rFonts w:ascii="Calibri" w:hAnsi="Calibri"/>
+              </w:rPr>
+              <w:t>Host: ob-sandbox.banksampoerna.co.id</w:t>
             </w:r>
           </w:p>
           <w:p>
@@ -3769,17 +3780,6 @@
                 <w:rFonts w:ascii="Calibri" w:hAnsi="Calibri"/>
               </w:rPr>
               <w:t>[</w:t>
-            </w:r>
-          </w:p>
-          <w:p>
-            <w:pPr>
-              <w:jc w:val="left"/>
-            </w:pPr>
-            <w:r>
-              <w:rPr>
-                <w:rFonts w:ascii="Calibri" w:hAnsi="Calibri"/>
-              </w:rPr>
-              <w:t xml:space="preserve">  "Host=ob-sandbox.banksampoerna.co.id",</w:t>
             </w:r>
           </w:p>
           <w:p>
@@ -4211,7 +4211,18 @@
               <w:rPr>
                 <w:rFonts w:ascii="Calibri" w:hAnsi="Calibri"/>
               </w:rPr>
-              <w:t>https://ob-sandbox.banksampoerna.co.id/snap-qris/v1.1/qr/qr-mpm-generate</w:t>
+              <w:t>POST /snap-qris/v1.1/qr/qr-mpm-generate HTTP/1.1</w:t>
+            </w:r>
+          </w:p>
+          <w:p>
+            <w:pPr>
+              <w:jc w:val="left"/>
+            </w:pPr>
+            <w:r>
+              <w:rPr>
+                <w:rFonts w:ascii="Calibri" w:hAnsi="Calibri"/>
+              </w:rPr>
+              <w:t>Host: ob-sandbox.banksampoerna.co.id</w:t>
             </w:r>
           </w:p>
           <w:p>
@@ -4245,17 +4256,6 @@
                 <w:rFonts w:ascii="Calibri" w:hAnsi="Calibri"/>
               </w:rPr>
               <w:t>[</w:t>
-            </w:r>
-          </w:p>
-          <w:p>
-            <w:pPr>
-              <w:jc w:val="left"/>
-            </w:pPr>
-            <w:r>
-              <w:rPr>
-                <w:rFonts w:ascii="Calibri" w:hAnsi="Calibri"/>
-              </w:rPr>
-              <w:t xml:space="preserve">  "Host=ob-sandbox.banksampoerna.co.id",</w:t>
             </w:r>
           </w:p>
           <w:p>
@@ -4676,7 +4676,18 @@
               <w:rPr>
                 <w:rFonts w:ascii="Calibri" w:hAnsi="Calibri"/>
               </w:rPr>
-              <w:t>https://ob-sandbox.banksampoerna.co.id/snap-qris/v1.1/qr/qr-mpm-generate</w:t>
+              <w:t>POST /snap-qris/v1.1/qr/qr-mpm-generate HTTP/1.1</w:t>
+            </w:r>
+          </w:p>
+          <w:p>
+            <w:pPr>
+              <w:jc w:val="left"/>
+            </w:pPr>
+            <w:r>
+              <w:rPr>
+                <w:rFonts w:ascii="Calibri" w:hAnsi="Calibri"/>
+              </w:rPr>
+              <w:t>Host: ob-sandbox.banksampoerna.co.id</w:t>
             </w:r>
           </w:p>
           <w:p>
@@ -4710,17 +4721,6 @@
                 <w:rFonts w:ascii="Calibri" w:hAnsi="Calibri"/>
               </w:rPr>
               <w:t>[</w:t>
-            </w:r>
-          </w:p>
-          <w:p>
-            <w:pPr>
-              <w:jc w:val="left"/>
-            </w:pPr>
-            <w:r>
-              <w:rPr>
-                <w:rFonts w:ascii="Calibri" w:hAnsi="Calibri"/>
-              </w:rPr>
-              <w:t xml:space="preserve">  "Host=ob-sandbox.banksampoerna.co.id",</w:t>
             </w:r>
           </w:p>
           <w:p>
@@ -5152,7 +5152,18 @@
               <w:rPr>
                 <w:rFonts w:ascii="Calibri" w:hAnsi="Calibri"/>
               </w:rPr>
-              <w:t>https://ob-sandbox.banksampoerna.co.id/snap-qris/v1.1/qr/qr-mpm-generate</w:t>
+              <w:t>POST /snap-qris/v1.1/qr/qr-mpm-generate HTTP/1.1</w:t>
+            </w:r>
+          </w:p>
+          <w:p>
+            <w:pPr>
+              <w:jc w:val="left"/>
+            </w:pPr>
+            <w:r>
+              <w:rPr>
+                <w:rFonts w:ascii="Calibri" w:hAnsi="Calibri"/>
+              </w:rPr>
+              <w:t>Host: ob-sandbox.banksampoerna.co.id</w:t>
             </w:r>
           </w:p>
           <w:p>
@@ -5186,17 +5197,6 @@
                 <w:rFonts w:ascii="Calibri" w:hAnsi="Calibri"/>
               </w:rPr>
               <w:t>[</w:t>
-            </w:r>
-          </w:p>
-          <w:p>
-            <w:pPr>
-              <w:jc w:val="left"/>
-            </w:pPr>
-            <w:r>
-              <w:rPr>
-                <w:rFonts w:ascii="Calibri" w:hAnsi="Calibri"/>
-              </w:rPr>
-              <w:t xml:space="preserve">  "Host=ob-sandbox.banksampoerna.co.id",</w:t>
             </w:r>
           </w:p>
           <w:p>
@@ -5628,7 +5628,18 @@
               <w:rPr>
                 <w:rFonts w:ascii="Calibri" w:hAnsi="Calibri"/>
               </w:rPr>
-              <w:t>https://ob-sandbox.banksampoerna.co.id/snap-qris/v1.1/qr/qr-mpm-generate</w:t>
+              <w:t>POST /snap-qris/v1.1/qr/qr-mpm-generate HTTP/1.1</w:t>
+            </w:r>
+          </w:p>
+          <w:p>
+            <w:pPr>
+              <w:jc w:val="left"/>
+            </w:pPr>
+            <w:r>
+              <w:rPr>
+                <w:rFonts w:ascii="Calibri" w:hAnsi="Calibri"/>
+              </w:rPr>
+              <w:t>Host: ob-sandbox.banksampoerna.co.id</w:t>
             </w:r>
           </w:p>
           <w:p>
@@ -5662,17 +5673,6 @@
                 <w:rFonts w:ascii="Calibri" w:hAnsi="Calibri"/>
               </w:rPr>
               <w:t>[</w:t>
-            </w:r>
-          </w:p>
-          <w:p>
-            <w:pPr>
-              <w:jc w:val="left"/>
-            </w:pPr>
-            <w:r>
-              <w:rPr>
-                <w:rFonts w:ascii="Calibri" w:hAnsi="Calibri"/>
-              </w:rPr>
-              <w:t xml:space="preserve">  "Host=ob-sandbox.banksampoerna.co.id",</w:t>
             </w:r>
           </w:p>
           <w:p>
@@ -6104,7 +6104,18 @@
               <w:rPr>
                 <w:rFonts w:ascii="Calibri" w:hAnsi="Calibri"/>
               </w:rPr>
-              <w:t>https://ob-sandbox.banksampoerna.co.id/snap-qris/v1.1/qr/qr-mpm-generate</w:t>
+              <w:t>POST /snap-qris/v1.1/qr/qr-mpm-generate HTTP/1.1</w:t>
+            </w:r>
+          </w:p>
+          <w:p>
+            <w:pPr>
+              <w:jc w:val="left"/>
+            </w:pPr>
+            <w:r>
+              <w:rPr>
+                <w:rFonts w:ascii="Calibri" w:hAnsi="Calibri"/>
+              </w:rPr>
+              <w:t>Host: ob-sandbox.banksampoerna.co.id</w:t>
             </w:r>
           </w:p>
           <w:p>
@@ -6138,17 +6149,6 @@
                 <w:rFonts w:ascii="Calibri" w:hAnsi="Calibri"/>
               </w:rPr>
               <w:t>[</w:t>
-            </w:r>
-          </w:p>
-          <w:p>
-            <w:pPr>
-              <w:jc w:val="left"/>
-            </w:pPr>
-            <w:r>
-              <w:rPr>
-                <w:rFonts w:ascii="Calibri" w:hAnsi="Calibri"/>
-              </w:rPr>
-              <w:t xml:space="preserve">  "Host=ob-sandbox.banksampoerna.co.id",</w:t>
             </w:r>
           </w:p>
           <w:p>
@@ -7493,7 +7493,18 @@
               <w:rPr>
                 <w:rFonts w:ascii="Calibri" w:hAnsi="Calibri"/>
               </w:rPr>
-              <w:t>https://ob-sandbox.banksampoerna.co.id/snap-qris/v1.1/qr/qr-mpm-query</w:t>
+              <w:t>POST /snap-qris/v1.1/qr/qr-mpm-query HTTP/1.1</w:t>
+            </w:r>
+          </w:p>
+          <w:p>
+            <w:pPr>
+              <w:jc w:val="left"/>
+            </w:pPr>
+            <w:r>
+              <w:rPr>
+                <w:rFonts w:ascii="Calibri" w:hAnsi="Calibri"/>
+              </w:rPr>
+              <w:t>Host: ob-sandbox.banksampoerna.co.id</w:t>
             </w:r>
           </w:p>
           <w:p>
@@ -7527,17 +7538,6 @@
                 <w:rFonts w:ascii="Calibri" w:hAnsi="Calibri"/>
               </w:rPr>
               <w:t>[</w:t>
-            </w:r>
-          </w:p>
-          <w:p>
-            <w:pPr>
-              <w:jc w:val="left"/>
-            </w:pPr>
-            <w:r>
-              <w:rPr>
-                <w:rFonts w:ascii="Calibri" w:hAnsi="Calibri"/>
-              </w:rPr>
-              <w:t xml:space="preserve">  "Host=ob-sandbox.banksampoerna.co.id",</w:t>
             </w:r>
           </w:p>
           <w:p>
@@ -7917,7 +7917,18 @@
               <w:rPr>
                 <w:rFonts w:ascii="Calibri" w:hAnsi="Calibri"/>
               </w:rPr>
-              <w:t>https://ob-sandbox.banksampoerna.co.id/snap-qris/v1.1/qr/qr-mpm-query</w:t>
+              <w:t>POST /snap-qris/v1.1/qr/qr-mpm-query HTTP/1.1</w:t>
+            </w:r>
+          </w:p>
+          <w:p>
+            <w:pPr>
+              <w:jc w:val="left"/>
+            </w:pPr>
+            <w:r>
+              <w:rPr>
+                <w:rFonts w:ascii="Calibri" w:hAnsi="Calibri"/>
+              </w:rPr>
+              <w:t>Host: ob-sandbox.banksampoerna.co.id</w:t>
             </w:r>
           </w:p>
           <w:p>
@@ -7951,17 +7962,6 @@
                 <w:rFonts w:ascii="Calibri" w:hAnsi="Calibri"/>
               </w:rPr>
               <w:t>[</w:t>
-            </w:r>
-          </w:p>
-          <w:p>
-            <w:pPr>
-              <w:jc w:val="left"/>
-            </w:pPr>
-            <w:r>
-              <w:rPr>
-                <w:rFonts w:ascii="Calibri" w:hAnsi="Calibri"/>
-              </w:rPr>
-              <w:t xml:space="preserve">  "Host=ob-sandbox.banksampoerna.co.id",</w:t>
             </w:r>
           </w:p>
           <w:p>
@@ -8341,7 +8341,18 @@
               <w:rPr>
                 <w:rFonts w:ascii="Calibri" w:hAnsi="Calibri"/>
               </w:rPr>
-              <w:t>https://ob-sandbox.banksampoerna.co.id/snap-qris/v1.1/qr/qr-mpm-query</w:t>
+              <w:t>POST /snap-qris/v1.1/qr/qr-mpm-query HTTP/1.1</w:t>
+            </w:r>
+          </w:p>
+          <w:p>
+            <w:pPr>
+              <w:jc w:val="left"/>
+            </w:pPr>
+            <w:r>
+              <w:rPr>
+                <w:rFonts w:ascii="Calibri" w:hAnsi="Calibri"/>
+              </w:rPr>
+              <w:t>Host: ob-sandbox.banksampoerna.co.id</w:t>
             </w:r>
           </w:p>
           <w:p>
@@ -8375,17 +8386,6 @@
                 <w:rFonts w:ascii="Calibri" w:hAnsi="Calibri"/>
               </w:rPr>
               <w:t>[</w:t>
-            </w:r>
-          </w:p>
-          <w:p>
-            <w:pPr>
-              <w:jc w:val="left"/>
-            </w:pPr>
-            <w:r>
-              <w:rPr>
-                <w:rFonts w:ascii="Calibri" w:hAnsi="Calibri"/>
-              </w:rPr>
-              <w:t xml:space="preserve">  "Host=ob-sandbox.banksampoerna.co.id",</w:t>
             </w:r>
           </w:p>
           <w:p>

</xml_diff>